<commit_message>
Match AIA International styling exactly; add poster, tiered fees, English-only
- Header/footer now mirror aiainternational.org exactly: header #212121 with
  the real AIA nav, footer #1f1f1f with the actual chapter/section links.
- Typography and colours sampled from the live AIA page: proxima-nova, body
  rgba(26,26,26,.7) 18px, h2 #4a4a4a 22px/400/uppercase/2px, footer headings
  rgba(255,255,255,.4), footer links #fff 13px uppercase.
- Added the call-for-entries poster at the top of the page (as on the AIA
  South Korea page), reproduced in CSS and container-query scaled.
- Entry fees restructured into three tiers (half price to 31 Aug, 20% off
  1 Sep-18 Oct, full price after 18 Oct) across ATAM / OA / ILA.
- Contact address changed to aiataipeiaward@gmail.com (page + forms .docx).
- Sponsors section set to "Coming soon".
- Page is now entirely in English.

Co-Authored-By: Claude Opus 4.8 <noreply@anthropic.com>
</commit_message>
<xml_diff>
--- a/downloads/2026-AIA-Taipei-AWARDS_Appendix-Forms-A-E.docx
+++ b/downloads/2026-AIA-Taipei-AWARDS_Appendix-Forms-A-E.docx
@@ -1282,7 +1282,7 @@
         <w:rPr>
           <w:rFonts w:ascii="Aptos" w:hAnsi="Aptos"/>
         </w:rPr>
-        <w:t>Taiwan-Licensed Architect</w:t>
+        <w:t>International Licensed Architect (ILA)</w:t>
       </w:r>
     </w:p>
     <w:p>
@@ -5579,7 +5579,7 @@
             <w:rStyle w:val="Hyperlink"/>
             <w:rFonts w:ascii="Aptos" w:hAnsi="Aptos"/>
           </w:rPr>
-          <w:t>aia.taipei@aiainternational.org</w:t>
+          <w:t>aiataipeiaward@gmail.com</w:t>
         </w:r>
       </w:hyperlink>
       <w:r>

</xml_diff>

<commit_message>
Fix remaining South Korea references in the forms and page
The Appendix A eligibility checkbox still read "AIA South Korea Architect".
The words were split across separate XML runs in the .docx, so the earlier
find-and-replace never matched them; it now reads "AIA Taipei Architect
Member", matching the wording used on the page. Also drops a stale mention
of the South Korea page from a CSS comment.

A scan of the page and every XML part of the .docx now reports zero
Korea/Korean/Seoul/KST references.

Co-Authored-By: Claude Opus 4.8 <noreply@anthropic.com>
</commit_message>
<xml_diff>
--- a/downloads/2026-AIA-Taipei-AWARDS_Appendix-Forms-A-E.docx
+++ b/downloads/2026-AIA-Taipei-AWARDS_Appendix-Forms-A-E.docx
@@ -1198,19 +1198,19 @@
         <w:rPr>
           <w:rFonts w:ascii="Aptos" w:hAnsi="Aptos"/>
         </w:rPr>
-        <w:t xml:space="preserve">South </w:t>
-      </w:r>
-      <w:r>
-        <w:rPr>
-          <w:rFonts w:ascii="Aptos" w:hAnsi="Aptos"/>
-        </w:rPr>
-        <w:t>Korea</w:t>
-      </w:r>
-      <w:r>
-        <w:rPr>
-          <w:rFonts w:ascii="Aptos" w:hAnsi="Aptos"/>
-        </w:rPr>
-        <w:t xml:space="preserve"> Architect </w:t>
+        <w:t xml:space="preserve">Taipei</w:t>
+      </w:r>
+      <w:r>
+        <w:rPr>
+          <w:rFonts w:ascii="Aptos" w:hAnsi="Aptos"/>
+        </w:rPr>
+        <w:t/>
+      </w:r>
+      <w:r>
+        <w:rPr>
+          <w:rFonts w:ascii="Aptos" w:hAnsi="Aptos"/>
+        </w:rPr>
+        <w:t xml:space="preserve"> Architect Member </w:t>
       </w:r>
       <w:r>
         <w:rPr>

</xml_diff>

<commit_message>
Replace the AIA South Korea logo in the forms header
The .docx header carried the South Korea logo as an embedded image
(word/media/image1.jpg). Earlier sweeps only scanned text, so it survived
every pass. Rebuilt it as an AIA Taipei lockup: the original AIA mark is
kept pixel-for-pixel and only the wordmark is redrawn, matching the source
cap-height (129px) and baseline. The header's display width was scaled with
it so Word does not stretch the narrower image.

Rendered all 12 pages to PDF to confirm: logo correct on every page, zero
Korea references in the output.

Co-Authored-By: Claude Opus 4.8 <noreply@anthropic.com>
</commit_message>
<xml_diff>
--- a/downloads/2026-AIA-Taipei-AWARDS_Appendix-Forms-A-E.docx
+++ b/downloads/2026-AIA-Taipei-AWARDS_Appendix-Forms-A-E.docx
@@ -6744,10 +6744,10 @@
           <wp:positionV relativeFrom="paragraph">
             <wp:posOffset>169545</wp:posOffset>
           </wp:positionV>
-          <wp:extent cx="1388110" cy="365760"/>
+          <wp:extent cx="931817" cy="365760"/>
           <wp:effectExtent l="0" t="0" r="2540" b="0"/>
           <wp:wrapNone/>
-          <wp:docPr id="54971217" name="Picture 1" descr="A black text on a white background&#10;&#10;Description automatically generated"/>
+          <wp:docPr id="54971217" name="Picture 1" descr="AIA Taipei logo"/>
           <wp:cNvGraphicFramePr>
             <a:graphicFrameLocks xmlns:a="http://schemas.openxmlformats.org/drawingml/2006/main" noChangeAspect="1"/>
           </wp:cNvGraphicFramePr>
@@ -6773,7 +6773,7 @@
                 <pic:spPr>
                   <a:xfrm>
                     <a:off x="0" y="0"/>
-                    <a:ext cx="1388110" cy="365760"/>
+                    <a:ext cx="931817" cy="365760"/>
                   </a:xfrm>
                   <a:prstGeom prst="rect">
                     <a:avLst/>

</xml_diff>

<commit_message>
Anchor the forms logo inside the header instead of floating it
The logo was a floating anchor (wp:anchor + wrapNone) carried over from the
South Korea template. Floating means the renderer decides where it lands, and
in Word it dropped onto the body text instead of staying in the header.

Made it a proper inline image in the header paragraph, so it is part of the
header flow and cannot overlap body content in any renderer. The inline image
adds a line to the header, which pushed the document to 13 pages, so one of
the header's five empty spacer paragraphs is removed to bring it back to the
original 12.

Verified: logo at y28-57pt on every page, clear of the 72pt top margin;
12 pages; zero Korea references.

Co-Authored-By: Claude Opus 4.8 <noreply@anthropic.com>
</commit_message>
<xml_diff>
--- a/downloads/2026-AIA-Taipei-AWARDS_Appendix-Forms-A-E.docx
+++ b/downloads/2026-AIA-Taipei-AWARDS_Appendix-Forms-A-E.docx
@@ -6736,17 +6736,9 @@
         <w:color w:val="000000"/>
       </w:rPr>
       <w:drawing>
-        <wp:anchor distT="0" distB="0" distL="114300" distR="114300" simplePos="0" relativeHeight="251658240" behindDoc="0" locked="0" layoutInCell="1" allowOverlap="1" wp14:anchorId="221D6EEE" wp14:editId="634FF2E9">
-          <wp:simplePos x="0" y="0"/>
-          <wp:positionH relativeFrom="margin">
-            <wp:align>left</wp:align>
-          </wp:positionH>
-          <wp:positionV relativeFrom="paragraph">
-            <wp:posOffset>169545</wp:posOffset>
-          </wp:positionV>
+        <wp:inline distT="0" distB="0" distL="0" distR="0">
           <wp:extent cx="931817" cy="365760"/>
           <wp:effectExtent l="0" t="0" r="2540" b="0"/>
-          <wp:wrapNone/>
           <wp:docPr id="54971217" name="Picture 1" descr="AIA Taipei logo"/>
           <wp:cNvGraphicFramePr>
             <a:graphicFrameLocks xmlns:a="http://schemas.openxmlformats.org/drawingml/2006/main" noChangeAspect="1"/>
@@ -6782,13 +6774,7 @@
               </pic:pic>
             </a:graphicData>
           </a:graphic>
-          <wp14:sizeRelH relativeFrom="page">
-            <wp14:pctWidth>0</wp14:pctWidth>
-          </wp14:sizeRelH>
-          <wp14:sizeRelV relativeFrom="page">
-            <wp14:pctHeight>0</wp14:pctHeight>
-          </wp14:sizeRelV>
-        </wp:anchor>
+        </wp:inline>
       </w:drawing>
     </w:r>
   </w:p>
@@ -6882,28 +6868,6 @@
       </w:rPr>
       <w:t xml:space="preserve">                                                    </w:t>
     </w:r>
-  </w:p>
-  <w:p>
-    <w:pPr>
-      <w:widowControl/>
-      <w:pBdr>
-        <w:top w:val="nil"/>
-        <w:left w:val="nil"/>
-        <w:bottom w:val="nil"/>
-        <w:right w:val="nil"/>
-        <w:between w:val="nil"/>
-      </w:pBdr>
-      <w:tabs>
-        <w:tab w:val="center" w:pos="4252"/>
-        <w:tab w:val="right" w:pos="6804"/>
-      </w:tabs>
-      <w:spacing w:line="240" w:lineRule="auto"/>
-      <w:rPr>
-        <w:rFonts w:eastAsia="Malgun Gothic"/>
-        <w:color w:val="000000"/>
-        <w:lang w:eastAsia="ko-KR"/>
-      </w:rPr>
-    </w:pPr>
   </w:p>
 </w:hdr>
 </file>

</xml_diff>

<commit_message>
Match the original header layout exactly
Going inline lost the 13.35pt drop the floating anchor gave the logo via its
posV offset, and added a line to the header. Restored the offset as 267 twip
space-before on the image paragraph, and removed two of the header's five
empty spacer paragraphs to absorb the line the inline image occupies.

Verified against the South Korea original, rendered side by side:
12 pages both, identical page size, logo at y41-70 on every page, body text
within 1pt, and every appendix starting on the same page (A1 B3 C7 D9 E11).

Co-Authored-By: Claude Opus 4.8 <noreply@anthropic.com>
</commit_message>
<xml_diff>
--- a/downloads/2026-AIA-Taipei-AWARDS_Appendix-Forms-A-E.docx
+++ b/downloads/2026-AIA-Taipei-AWARDS_Appendix-Forms-A-E.docx
@@ -6723,7 +6723,7 @@
         <w:tab w:val="center" w:pos="4252"/>
         <w:tab w:val="right" w:pos="6804"/>
       </w:tabs>
-      <w:spacing w:line="240" w:lineRule="auto"/>
+      <w:spacing w:before="267" w:line="240" w:lineRule="auto"/>
       <w:rPr>
         <w:rFonts w:ascii="Gill Sans" w:eastAsia="Gill Sans" w:hAnsi="Gill Sans" w:cs="Gill Sans"/>
         <w:color w:val="000000"/>
@@ -6838,35 +6838,6 @@
         <w:color w:val="000000"/>
       </w:rPr>
       <w:t xml:space="preserve">                                                     </w:t>
-    </w:r>
-  </w:p>
-  <w:p>
-    <w:pPr>
-      <w:widowControl/>
-      <w:pBdr>
-        <w:top w:val="nil"/>
-        <w:left w:val="nil"/>
-        <w:bottom w:val="nil"/>
-        <w:right w:val="nil"/>
-        <w:between w:val="nil"/>
-      </w:pBdr>
-      <w:tabs>
-        <w:tab w:val="center" w:pos="4252"/>
-        <w:tab w:val="right" w:pos="6804"/>
-      </w:tabs>
-      <w:spacing w:line="240" w:lineRule="auto"/>
-      <w:rPr>
-        <w:rFonts w:ascii="Gill Sans" w:eastAsia="Malgun Gothic" w:hAnsi="Gill Sans" w:cs="Gill Sans" w:hint="eastAsia"/>
-        <w:color w:val="000000"/>
-        <w:lang w:eastAsia="ko-KR"/>
-      </w:rPr>
-    </w:pPr>
-    <w:r>
-      <w:rPr>
-        <w:rFonts w:ascii="Gill Sans" w:eastAsia="Gill Sans" w:hAnsi="Gill Sans" w:cs="Gill Sans"/>
-        <w:color w:val="000000"/>
-      </w:rPr>
-      <w:t xml:space="preserve">                                                    </w:t>
     </w:r>
   </w:p>
 </w:hdr>

</xml_diff>

<commit_message>
Drop the client authorisation from Appendix E
Appendix E is now a photographer-only release: the Owner/Client
Authorization section and its fields are gone, and the photographer section
is renumbered Section 1.

Followed the change through everywhere it was referenced rather than just
the form itself - the appendix title and subtitle, the submission
requirements list, the Appendix D checklist line, Appendix E's own intro and
closing note, and the line in Appendix A that told entrants to have the
client sign Appendix E. Also tidied two leftovers that surfaced while
editing: a doubled full stop in Appendix A and a stray capital in the
Appendix D portfolio item.

Rendered to PDF to check: still 12 pages, zero client-authorisation
references, and no "Section 2" anywhere.

Co-Authored-By: Claude Opus 4.8 <noreply@anthropic.com>
</commit_message>
<xml_diff>
--- a/downloads/2026-AIA-Taipei-AWARDS_Appendix-Forms-A-E.docx
+++ b/downloads/2026-AIA-Taipei-AWARDS_Appendix-Forms-A-E.docx
@@ -1639,47 +1639,47 @@
           <w:i/>
           <w:iCs/>
         </w:rPr>
-        <w:t xml:space="preserve">. </w:t>
-      </w:r>
-      <w:r>
-        <w:rPr>
-          <w:rFonts w:ascii="Aptos" w:hAnsi="Aptos"/>
-          <w:i/>
-          <w:iCs/>
-        </w:rPr>
-        <w:t>Please</w:t>
-      </w:r>
-      <w:r>
-        <w:rPr>
-          <w:rFonts w:ascii="Aptos" w:hAnsi="Aptos"/>
-          <w:i/>
-          <w:iCs/>
-        </w:rPr>
-        <w:t xml:space="preserve"> also</w:t>
-      </w:r>
-      <w:r>
-        <w:rPr>
-          <w:rFonts w:ascii="Aptos" w:hAnsi="Aptos"/>
-          <w:i/>
-          <w:iCs/>
-        </w:rPr>
-        <w:t xml:space="preserve"> ensure that the Client </w:t>
-      </w:r>
-      <w:r>
-        <w:rPr>
-          <w:rFonts w:ascii="Aptos" w:hAnsi="Aptos"/>
-          <w:i/>
-          <w:iCs/>
-        </w:rPr>
-        <w:t>signs</w:t>
-      </w:r>
-      <w:r>
-        <w:rPr>
-          <w:rFonts w:ascii="Aptos" w:hAnsi="Aptos"/>
-          <w:i/>
-          <w:iCs/>
-        </w:rPr>
-        <w:t xml:space="preserve"> the Appendix E permission form</w:t>
+        <w:t xml:space="preserve"/>
+      </w:r>
+      <w:r>
+        <w:rPr>
+          <w:rFonts w:ascii="Aptos" w:hAnsi="Aptos"/>
+          <w:i/>
+          <w:iCs/>
+        </w:rPr>
+        <w:t/>
+      </w:r>
+      <w:r>
+        <w:rPr>
+          <w:rFonts w:ascii="Aptos" w:hAnsi="Aptos"/>
+          <w:i/>
+          <w:iCs/>
+        </w:rPr>
+        <w:t xml:space="preserve"/>
+      </w:r>
+      <w:r>
+        <w:rPr>
+          <w:rFonts w:ascii="Aptos" w:hAnsi="Aptos"/>
+          <w:i/>
+          <w:iCs/>
+        </w:rPr>
+        <w:t xml:space="preserve"/>
+      </w:r>
+      <w:r>
+        <w:rPr>
+          <w:rFonts w:ascii="Aptos" w:hAnsi="Aptos"/>
+          <w:i/>
+          <w:iCs/>
+        </w:rPr>
+        <w:t/>
+      </w:r>
+      <w:r>
+        <w:rPr>
+          <w:rFonts w:ascii="Aptos" w:hAnsi="Aptos"/>
+          <w:i/>
+          <w:iCs/>
+        </w:rPr>
+        <w:t xml:space="preserve"/>
       </w:r>
       <w:r>
         <w:rPr>
@@ -5255,7 +5255,7 @@
         <w:rPr>
           <w:rFonts w:ascii="Aptos" w:hAnsi="Aptos"/>
         </w:rPr>
-        <w:t>, Anonymous</w:t>
+        <w:t>, anonymous.</w:t>
       </w:r>
     </w:p>
     <w:p>
@@ -5307,13 +5307,13 @@
           <w:b/>
           <w:bCs/>
         </w:rPr>
-        <w:t>Client &amp; Photographer Permission Form</w:t>
-      </w:r>
-      <w:r>
-        <w:rPr>
-          <w:rFonts w:ascii="Aptos" w:hAnsi="Aptos"/>
-        </w:rPr>
-        <w:t xml:space="preserve"> (Appendix E) – Signed by project owner/client and photographer(s).</w:t>
+        <w:t>Photographer Permission Form</w:t>
+      </w:r>
+      <w:r>
+        <w:rPr>
+          <w:rFonts w:ascii="Aptos" w:hAnsi="Aptos"/>
+        </w:rPr>
+        <w:t xml:space="preserve"> (Appendix E) – Signed by the photographer(s).</w:t>
       </w:r>
     </w:p>
     <w:p>
@@ -5805,7 +5805,7 @@
           <w:szCs w:val="32"/>
         </w:rPr>
         <w:lastRenderedPageBreak/>
-        <w:t>APPENDIX E: CLIENT &amp; PHOTOGRAPHER PERMISSION FORM</w:t>
+        <w:t>APPENDIX E: PHOTOGRAPHER PERMISSION FORM</w:t>
       </w:r>
     </w:p>
     <w:p>
@@ -5849,22 +5849,22 @@
           <w:b/>
           <w:bCs/>
         </w:rPr>
-        <w:t xml:space="preserve"> AIA Taipei Design Awards – Client and Photographer Permission Form</w:t>
-      </w:r>
-    </w:p>
-    <w:p>
-      <w:pPr>
-        <w:kinsoku w:val="0"/>
-        <w:spacing w:after="120" w:line="276" w:lineRule="auto"/>
-        <w:rPr>
-          <w:rFonts w:ascii="Aptos" w:hAnsi="Aptos"/>
-        </w:rPr>
-      </w:pPr>
-      <w:r>
-        <w:rPr>
-          <w:rFonts w:ascii="Aptos" w:hAnsi="Aptos"/>
-        </w:rPr>
-        <w:t>For each project submitted, the project’s owner (client) and the photographer(s) of the images must grant permission for the project’s participation and the use of photographs. This form may be duplicated if needed for multiple signatories (e.g., more than one photographer). Both sections should be completed as applicable.</w:t>
+        <w:t xml:space="preserve"> AIA Taipei Design Awards – Photographer Permission Form</w:t>
+      </w:r>
+    </w:p>
+    <w:p>
+      <w:pPr>
+        <w:kinsoku w:val="0"/>
+        <w:spacing w:after="120" w:line="276" w:lineRule="auto"/>
+        <w:rPr>
+          <w:rFonts w:ascii="Aptos" w:hAnsi="Aptos"/>
+        </w:rPr>
+      </w:pPr>
+      <w:r>
+        <w:rPr>
+          <w:rFonts w:ascii="Aptos" w:hAnsi="Aptos"/>
+        </w:rPr>
+        <w:t>For each project submitted, the photographer(s) of the images must grant permission for the use of those photographs. This form may be duplicated if needed for more than one photographer.</w:t>
       </w:r>
     </w:p>
     <w:p>
@@ -5928,253 +5928,7 @@
           <w:b/>
           <w:bCs/>
         </w:rPr>
-        <w:t>Section 1: Owner/Client Authorization</w:t>
-      </w:r>
-    </w:p>
-    <w:p>
-      <w:pPr>
-        <w:kinsoku w:val="0"/>
-        <w:spacing w:after="120" w:line="276" w:lineRule="auto"/>
-        <w:rPr>
-          <w:rFonts w:ascii="Aptos" w:hAnsi="Aptos"/>
-        </w:rPr>
-      </w:pPr>
-      <w:r>
-        <w:rPr>
-          <w:rFonts w:ascii="Aptos" w:hAnsi="Aptos"/>
-        </w:rPr>
-        <w:t>I, the undersigned, represent that I am the owner or an authorized client representative of the above-named project. I hereby give permission for the project to be entered into the 202</w:t>
-      </w:r>
-      <w:r>
-        <w:rPr>
-          <w:rFonts w:ascii="Aptos" w:hAnsi="Aptos"/>
-        </w:rPr>
-        <w:t>6</w:t>
-      </w:r>
-      <w:r>
-        <w:rPr>
-          <w:rFonts w:ascii="Aptos" w:hAnsi="Aptos"/>
-        </w:rPr>
-        <w:t xml:space="preserve"> AIA Taipei Design Awards. I understand that this entails the project being photographed, described, and submitted to a jury for awards consideration. I further grant permission to the AIA Taipei </w:t>
-      </w:r>
-      <w:r>
-        <w:rPr>
-          <w:rFonts w:ascii="Aptos" w:hAnsi="Aptos"/>
-        </w:rPr>
-        <w:t>Section</w:t>
-      </w:r>
-      <w:r>
-        <w:rPr>
-          <w:rFonts w:ascii="Aptos" w:hAnsi="Aptos"/>
-        </w:rPr>
-        <w:t xml:space="preserve"> to use images and information of this project in publications or displays related to the Awards program (in print or digital media). I acknowledge that the architect has informed me of this </w:t>
-      </w:r>
-      <w:r>
-        <w:rPr>
-          <w:rFonts w:ascii="Aptos" w:hAnsi="Aptos"/>
-        </w:rPr>
-        <w:t>submission,</w:t>
-      </w:r>
-      <w:r>
-        <w:rPr>
-          <w:rFonts w:ascii="Aptos" w:hAnsi="Aptos"/>
-        </w:rPr>
-        <w:t xml:space="preserve"> and I fully support the entry, including recognition of the architect’s design authorship. If the project wins an award, I consent to AIA Taipei including the project in publicity and I agree that the project’s name and my (or my organization’s) name may be used in connection with the award announcement.</w:t>
-      </w:r>
-    </w:p>
-    <w:p>
-      <w:pPr>
-        <w:numPr>
-          <w:ilvl w:val="0"/>
-          <w:numId w:val="30"/>
-        </w:numPr>
-        <w:kinsoku w:val="0"/>
-        <w:adjustRightInd/>
-        <w:spacing w:after="120" w:line="276" w:lineRule="auto"/>
-        <w:textAlignment w:val="auto"/>
-        <w:rPr>
-          <w:rFonts w:ascii="Aptos" w:hAnsi="Aptos"/>
-        </w:rPr>
-      </w:pPr>
-      <w:r>
-        <w:rPr>
-          <w:rFonts w:ascii="Aptos" w:hAnsi="Aptos"/>
-          <w:b/>
-          <w:bCs/>
-        </w:rPr>
-        <w:t>Client/Owner Name:</w:t>
-      </w:r>
-      <w:r>
-        <w:rPr>
-          <w:rFonts w:ascii="Aptos" w:hAnsi="Aptos"/>
-        </w:rPr>
-        <w:t xml:space="preserve"> __________________________________</w:t>
-      </w:r>
-    </w:p>
-    <w:p>
-      <w:pPr>
-        <w:numPr>
-          <w:ilvl w:val="0"/>
-          <w:numId w:val="30"/>
-        </w:numPr>
-        <w:kinsoku w:val="0"/>
-        <w:adjustRightInd/>
-        <w:spacing w:after="120" w:line="276" w:lineRule="auto"/>
-        <w:textAlignment w:val="auto"/>
-        <w:rPr>
-          <w:rFonts w:ascii="Aptos" w:hAnsi="Aptos"/>
-        </w:rPr>
-      </w:pPr>
-      <w:r>
-        <w:rPr>
-          <w:rFonts w:ascii="Aptos" w:hAnsi="Aptos"/>
-          <w:b/>
-          <w:bCs/>
-        </w:rPr>
-        <w:t>Organization (if applicable):</w:t>
-      </w:r>
-      <w:r>
-        <w:rPr>
-          <w:rFonts w:ascii="Aptos" w:hAnsi="Aptos"/>
-        </w:rPr>
-        <w:t xml:space="preserve"> __________________________</w:t>
-      </w:r>
-    </w:p>
-    <w:p>
-      <w:pPr>
-        <w:numPr>
-          <w:ilvl w:val="0"/>
-          <w:numId w:val="30"/>
-        </w:numPr>
-        <w:kinsoku w:val="0"/>
-        <w:adjustRightInd/>
-        <w:spacing w:after="120" w:line="276" w:lineRule="auto"/>
-        <w:textAlignment w:val="auto"/>
-        <w:rPr>
-          <w:rFonts w:ascii="Aptos" w:hAnsi="Aptos"/>
-        </w:rPr>
-      </w:pPr>
-      <w:r>
-        <w:rPr>
-          <w:rFonts w:ascii="Aptos" w:hAnsi="Aptos"/>
-          <w:b/>
-          <w:bCs/>
-        </w:rPr>
-        <w:t>Title/Role:</w:t>
-      </w:r>
-      <w:r>
-        <w:rPr>
-          <w:rFonts w:ascii="Aptos" w:hAnsi="Aptos"/>
-        </w:rPr>
-        <w:t xml:space="preserve"> _________________________________________</w:t>
-      </w:r>
-    </w:p>
-    <w:p>
-      <w:pPr>
-        <w:numPr>
-          <w:ilvl w:val="0"/>
-          <w:numId w:val="30"/>
-        </w:numPr>
-        <w:kinsoku w:val="0"/>
-        <w:adjustRightInd/>
-        <w:spacing w:after="120" w:line="276" w:lineRule="auto"/>
-        <w:textAlignment w:val="auto"/>
-        <w:rPr>
-          <w:rFonts w:ascii="Aptos" w:hAnsi="Aptos"/>
-        </w:rPr>
-      </w:pPr>
-      <w:r>
-        <w:rPr>
-          <w:rFonts w:ascii="Aptos" w:hAnsi="Aptos"/>
-          <w:b/>
-          <w:bCs/>
-        </w:rPr>
-        <w:t>Email or Contact Phone:</w:t>
-      </w:r>
-      <w:r>
-        <w:rPr>
-          <w:rFonts w:ascii="Aptos" w:hAnsi="Aptos"/>
-        </w:rPr>
-        <w:t xml:space="preserve"> ______________________________</w:t>
-      </w:r>
-    </w:p>
-    <w:p>
-      <w:pPr>
-        <w:numPr>
-          <w:ilvl w:val="0"/>
-          <w:numId w:val="30"/>
-        </w:numPr>
-        <w:kinsoku w:val="0"/>
-        <w:adjustRightInd/>
-        <w:spacing w:after="120" w:line="276" w:lineRule="auto"/>
-        <w:textAlignment w:val="auto"/>
-        <w:rPr>
-          <w:rFonts w:ascii="Aptos" w:hAnsi="Aptos"/>
-        </w:rPr>
-      </w:pPr>
-      <w:r>
-        <w:rPr>
-          <w:rFonts w:ascii="Aptos" w:hAnsi="Aptos"/>
-          <w:b/>
-          <w:bCs/>
-        </w:rPr>
-        <w:t>Signature (Client/Owner):</w:t>
-      </w:r>
-      <w:r>
-        <w:rPr>
-          <w:rFonts w:ascii="Aptos" w:hAnsi="Aptos"/>
-        </w:rPr>
-        <w:t xml:space="preserve"> ____________________________ </w:t>
-      </w:r>
-      <w:r>
-        <w:rPr>
-          <w:rFonts w:ascii="Aptos" w:hAnsi="Aptos"/>
-          <w:b/>
-          <w:bCs/>
-        </w:rPr>
-        <w:t>Date:</w:t>
-      </w:r>
-      <w:r>
-        <w:rPr>
-          <w:rFonts w:ascii="Aptos" w:hAnsi="Aptos"/>
-        </w:rPr>
-        <w:t xml:space="preserve"> ___________</w:t>
-      </w:r>
-    </w:p>
-    <w:p>
-      <w:pPr>
-        <w:kinsoku w:val="0"/>
-        <w:spacing w:after="120" w:line="276" w:lineRule="auto"/>
-        <w:rPr>
-          <w:rFonts w:ascii="Aptos" w:hAnsi="Aptos"/>
-        </w:rPr>
-      </w:pPr>
-      <w:r>
-        <w:rPr>
-          <w:rFonts w:ascii="Aptos" w:hAnsi="Aptos"/>
-          <w:i/>
-          <w:iCs/>
-        </w:rPr>
-        <w:t>(Client/Owner to sign above. If there are multiple owners, one authorized signature is sufficient. If the client is unavailable to sign, please contact the Awards Committee to discuss alternate proof of client permission.)</w:t>
-      </w:r>
-    </w:p>
-    <w:p>
-      <w:pPr>
-        <w:kinsoku w:val="0"/>
-        <w:spacing w:after="120" w:line="276" w:lineRule="auto"/>
-        <w:rPr>
-          <w:rFonts w:ascii="Aptos" w:hAnsi="Aptos"/>
-          <w:b/>
-          <w:bCs/>
-        </w:rPr>
-      </w:pPr>
-      <w:r>
-        <w:rPr>
-          <w:rFonts w:ascii="Aptos" w:hAnsi="Aptos"/>
-          <w:b/>
-          <w:bCs/>
-        </w:rPr>
-        <w:t>Section 2: Photographer Authorization</w:t>
+        <w:t>Section 1: Photographer Authorization</w:t>
       </w:r>
     </w:p>
     <w:p>
@@ -6449,7 +6203,7 @@
         <w:rPr>
           <w:rFonts w:ascii="Aptos" w:hAnsi="Aptos"/>
         </w:rPr>
-        <w:t xml:space="preserve"> This permission form is a required part of the submission. Without the client’s authorization and photographer’s release, the entry may be disqualified or not published by AIA. The intent is to ensure all parties are aware and in agreement with the project’s participation and publicity.</w:t>
+        <w:t xml:space="preserve"> This permission form is a required part of the submission. Without the photographer’s release, the entry may be disqualified or not published by AIA. The intent is to ensure all parties are aware and in agreement with the project’s participation and publicity.</w:t>
       </w:r>
     </w:p>
     <w:p>

</xml_diff>